<commit_message>
Fix python script to insert all missing tags and commit updated templates
</commit_message>
<xml_diff>
--- a/public/1_Template_Mailing.docx
+++ b/public/1_Template_Mailing.docx
@@ -118,7 +118,7 @@
                 <w:color w:val="000000"/>
                 <w:szCs w:val="16"/>
               </w:rPr>
-              <w:t>6 tháng)</w:t>
+              <w:t>6 {footer_date})</w:t>
             </w:r>
             <w:r>
               <w:rPr>
@@ -505,7 +505,7 @@
           <w:szCs w:val="26"/>
           <w:lang w:val="vi-VN"/>
         </w:rPr>
-        <w:t>- Họ và tên: {fullName}:  - Ngày sinh:  / / - Giới tính:   Nam   Nữ</w:t>
+        <w:t>- Họ và tên: {fullName}  - Ngày sinh:  / / - Giới tính:   Nam   Nữ</w:t>
       </w:r>
       <w:r>
         <w:rPr>
@@ -2664,7 +2664,7 @@
           <w:sz w:val="26"/>
           <w:szCs w:val="26"/>
         </w:rPr>
-        <w:t>Ngành: {uni_major}:………………………..………………….Chuyên ngành:………………………………………….</w:t>
+        <w:t>Ngành: {uni_major}………………………..………………….Chuyên ngành:………………………………………….</w:t>
       </w:r>
       <w:proofErr w:type="gramEnd"/>
       <w:r>
@@ -3353,7 +3353,7 @@
                 <w:szCs w:val="26"/>
                 <w:lang w:val="pt-BR"/>
               </w:rPr>
-              <w:t xml:space="preserve"> )</w:t>
+              <w:t>...)</w:t>
             </w:r>
           </w:p>
         </w:tc>
@@ -4457,7 +4457,7 @@
           <w:szCs w:val="26"/>
           <w:u w:val="single"/>
         </w:rPr>
-        <w:t>VI. CÁC CÔNG TRÌNH KHOA HỌC ĐÃ CÔNG BỐ:</w:t>
+        <w:t>VI. CÁC CÔNG TRÌNH KHOA HỌC: {#scientificWorks}{.}{/scientificWorks} ĐÃ CÔNG BỐ:</w:t>
       </w:r>
     </w:p>
     <w:p>
@@ -4617,7 +4617,7 @@
           <w:sz w:val="26"/>
           <w:szCs w:val="26"/>
         </w:rPr>
-        <w:t xml:space="preserve">Khen thưởng: {rewards}: ………………………………………………………………………………….…… </w:t>
+        <w:t xml:space="preserve">Khen thưởng: {rewards} ………………………………………………………………………………….…… </w:t>
       </w:r>
       <w:r>
         <w:rPr>
@@ -4693,7 +4693,7 @@
           <w:sz w:val="26"/>
           <w:szCs w:val="26"/>
         </w:rPr>
-        <w:t>Kỷ luật: {discipline}: ………………………………………………………………………………………..………</w:t>
+        <w:t>Kỷ luật: {discipline} ………………………………………………………………………………………..………</w:t>
       </w:r>
       <w:r>
         <w:rPr>
@@ -5088,7 +5088,7 @@
           <w:sz w:val="26"/>
           <w:szCs w:val="26"/>
         </w:rPr>
-        <w:t xml:space="preserve">- Địa chỉ thường trú: </w:t>
+        <w:t xml:space="preserve">- Địa chỉ: {father_address}: </w:t>
       </w:r>
       <w:r>
         <w:rPr>
@@ -5137,7 +5137,7 @@
           <w:sz w:val="26"/>
           <w:szCs w:val="26"/>
         </w:rPr>
-        <w:t xml:space="preserve">- Trình độ học vấn:   Sau đại học </w:t>
+        <w:t xml:space="preserve">- Trình độ: SĐH {father_edu_sdh} ĐH {father_edu_dh} CĐ {father_edu_cd} TC {father_edu_tc} PTTH {father_edu_ptth} Chưa TN {father_edu_chuatn}:   Sau đại học </w:t>
         <w:tab/>
         <w:t xml:space="preserve"> Đại học           Cao đẳng        Trung cấp</w:t>
         <w:tab/>
@@ -5463,7 +5463,7 @@
           <w:sz w:val="26"/>
           <w:szCs w:val="26"/>
         </w:rPr>
-        <w:t xml:space="preserve">- Địa chỉ thường trú: </w:t>
+        <w:t xml:space="preserve">- Địa chỉ: {father_address}: </w:t>
       </w:r>
       <w:r>
         <w:rPr>
@@ -5605,7 +5605,7 @@
           <w:sz w:val="26"/>
           <w:szCs w:val="26"/>
         </w:rPr>
-        <w:t xml:space="preserve">- Trình độ học vấn:    Sau đại học </w:t>
+        <w:t xml:space="preserve">- Trình độ: SĐH {father_edu_sdh} ĐH {father_edu_dh} CĐ {father_edu_cd} TC {father_edu_tc} PTTH {father_edu_ptth} Chưa TN {father_edu_chuatn}:    Sau đại học </w:t>
         <w:tab/>
         <w:t xml:space="preserve"> Đại học           Cao đẳng        Trung cấp</w:t>
         <w:tab/>
@@ -5875,7 +5875,7 @@
           <w:sz w:val="26"/>
           <w:szCs w:val="26"/>
         </w:rPr>
-        <w:t xml:space="preserve">- Địa chỉ thường trú: </w:t>
+        <w:t xml:space="preserve">- Địa chỉ: {father_address}: </w:t>
       </w:r>
       <w:r>
         <w:rPr>
@@ -6017,7 +6017,7 @@
           <w:sz w:val="26"/>
           <w:szCs w:val="26"/>
         </w:rPr>
-        <w:t xml:space="preserve">- Trình độ học vấn:    Sau đại học </w:t>
+        <w:t xml:space="preserve">- Trình độ: SĐH {father_edu_sdh} ĐH {father_edu_dh} CĐ {father_edu_cd} TC {father_edu_tc} PTTH {father_edu_ptth} Chưa TN {father_edu_chuatn}:    Sau đại học </w:t>
         <w:tab/>
         <w:t xml:space="preserve"> Đại học           Cao đẳng        Trung cấp</w:t>
         <w:tab/>
@@ -6270,7 +6270,12 @@
                 <w:sz w:val="26"/>
                 <w:szCs w:val="26"/>
               </w:rPr>
-              <w:t>XÁC NHẬN CỦA ĐỊA PHƯƠNG/</w:t>
+              <w:t>XÁC NHẬN CỦA ĐỊA PHƯƠNG</w:t>
+              <w:br/>
+              <w:br/>
+              <w:br/>
+              <w:br/>
+              <w:t>{footer_sig_dots}/</w:t>
             </w:r>
           </w:p>
           <w:p>
@@ -6341,7 +6346,7 @@
                 <w:sz w:val="26"/>
                 <w:szCs w:val="26"/>
               </w:rPr>
-              <w:t xml:space="preserve">…..……… , ngày   tháng …  năm 20 </w:t>
+              <w:t xml:space="preserve">…..……… {footer_date}   tháng …  năm 20 </w:t>
             </w:r>
             <w:proofErr w:type="gramEnd"/>
             <w:r>

</xml_diff>